<commit_message>
Programm mit allen Dateien
</commit_message>
<xml_diff>
--- a/Erläuterung des Spiels.docx
+++ b/Erläuterung des Spiels.docx
@@ -7,19 +7,27 @@
         <w:pStyle w:val="berschrift1"/>
       </w:pPr>
       <w:r>
+        <w:t>Übersicht über das Spiel</w:t>
+      </w:r>
+    </w:p>
+    <w:p>
+      <w:pPr>
+        <w:pStyle w:val="berschrift1"/>
+      </w:pPr>
+      <w:r>
         <w:drawing>
-          <wp:anchor distT="0" distB="0" distL="114300" distR="114300" simplePos="0" relativeHeight="251658240" behindDoc="0" locked="0" layoutInCell="1" allowOverlap="1" wp14:anchorId="76596B7C" wp14:editId="22AD45DA">
+          <wp:anchor distT="0" distB="0" distL="114300" distR="114300" simplePos="0" relativeHeight="251658240" behindDoc="0" locked="0" layoutInCell="1" allowOverlap="1" wp14:anchorId="27116E20" wp14:editId="370D7FB9">
             <wp:simplePos x="0" y="0"/>
             <wp:positionH relativeFrom="margin">
-              <wp:posOffset>-35626</wp:posOffset>
+              <wp:align>left</wp:align>
             </wp:positionH>
             <wp:positionV relativeFrom="paragraph">
-              <wp:posOffset>633878</wp:posOffset>
+              <wp:posOffset>91299</wp:posOffset>
             </wp:positionV>
-            <wp:extent cx="5438775" cy="7629525"/>
+            <wp:extent cx="5438775" cy="8391525"/>
             <wp:effectExtent l="0" t="0" r="9525" b="9525"/>
             <wp:wrapNone/>
-            <wp:docPr id="1294954321" name="Grafik 1" descr="Ein Bild, das Text, Screenshot, Schrift, parallel enthält.&#10;&#10;Automatisch generierte Beschreibung"/>
+            <wp:docPr id="956332467" name="Grafik 1" descr="Ein Bild, das Text, Screenshot, Diagramm, parallel enthält.&#10;&#10;Automatisch generierte Beschreibung"/>
             <wp:cNvGraphicFramePr>
               <a:graphicFrameLocks xmlns:a="http://schemas.openxmlformats.org/drawingml/2006/main" noChangeAspect="1"/>
             </wp:cNvGraphicFramePr>
@@ -27,7 +35,7 @@
               <a:graphicData uri="http://schemas.openxmlformats.org/drawingml/2006/picture">
                 <pic:pic xmlns:pic="http://schemas.openxmlformats.org/drawingml/2006/picture">
                   <pic:nvPicPr>
-                    <pic:cNvPr id="1294954321" name="Grafik 1" descr="Ein Bild, das Text, Screenshot, Schrift, parallel enthält.&#10;&#10;Automatisch generierte Beschreibung"/>
+                    <pic:cNvPr id="956332467" name="Grafik 1" descr="Ein Bild, das Text, Screenshot, Diagramm, parallel enthält.&#10;&#10;Automatisch generierte Beschreibung"/>
                     <pic:cNvPicPr/>
                   </pic:nvPicPr>
                   <pic:blipFill>
@@ -45,7 +53,7 @@
                   <pic:spPr>
                     <a:xfrm>
                       <a:off x="0" y="0"/>
-                      <a:ext cx="5438775" cy="7629525"/>
+                      <a:ext cx="5438775" cy="8391525"/>
                     </a:xfrm>
                     <a:prstGeom prst="rect">
                       <a:avLst/>
@@ -58,9 +66,6 @@
         </w:drawing>
       </w:r>
       <w:r>
-        <w:t>Übersicht über das Spiel</w:t>
-      </w:r>
-      <w:r>
         <w:br w:type="page"/>
       </w:r>
     </w:p>
@@ -2221,25 +2226,14 @@
         </w:rPr>
       </w:pPr>
       <w:proofErr w:type="spellStart"/>
-      <w:proofErr w:type="gramStart"/>
-      <w:r>
-        <w:rPr>
-          <w:rStyle w:val="HTMLCode"/>
-          <w:rFonts w:ascii="Consolas" w:eastAsiaTheme="majorEastAsia" w:hAnsi="Consolas"/>
-          <w:color w:val="111111"/>
-          <w:sz w:val="24"/>
-        </w:rPr>
-        <w:t>gebe</w:t>
-      </w:r>
-      <w:proofErr w:type="gramEnd"/>
-      <w:r>
-        <w:rPr>
-          <w:rStyle w:val="HTMLCode"/>
-          <w:rFonts w:ascii="Consolas" w:eastAsiaTheme="majorEastAsia" w:hAnsi="Consolas"/>
-          <w:color w:val="111111"/>
-          <w:sz w:val="24"/>
-        </w:rPr>
-        <w:t>_namen</w:t>
+      <w:r>
+        <w:rPr>
+          <w:rStyle w:val="HTMLCode"/>
+          <w:rFonts w:ascii="Consolas" w:eastAsiaTheme="majorEastAsia" w:hAnsi="Consolas"/>
+          <w:color w:val="111111"/>
+          <w:sz w:val="24"/>
+        </w:rPr>
+        <w:t>hole_richtung</w:t>
       </w:r>
       <w:proofErr w:type="spellEnd"/>
       <w:r>
@@ -2276,7 +2270,7 @@
           <w:rFonts w:ascii="Aptos" w:hAnsi="Aptos"/>
           <w:color w:val="111111"/>
         </w:rPr>
-        <w:t>: Diese Methode gibt den Namen des Sprites zurück.</w:t>
+        <w:t>: Diese Methode gibt die aktuelle Bewegungsrichtung des Sprites zurück.</w:t>
       </w:r>
     </w:p>
     <w:p>
@@ -2294,6 +2288,26 @@
         </w:rPr>
       </w:pPr>
       <w:proofErr w:type="spellStart"/>
+      <w:r>
+        <w:rPr>
+          <w:rStyle w:val="HTMLCode"/>
+          <w:rFonts w:ascii="Consolas" w:eastAsiaTheme="majorEastAsia" w:hAnsi="Consolas"/>
+          <w:color w:val="111111"/>
+          <w:sz w:val="24"/>
+        </w:rPr>
+        <w:t>setze_richtung</w:t>
+      </w:r>
+      <w:proofErr w:type="spellEnd"/>
+      <w:r>
+        <w:rPr>
+          <w:rStyle w:val="HTMLCode"/>
+          <w:rFonts w:ascii="Consolas" w:eastAsiaTheme="majorEastAsia" w:hAnsi="Consolas"/>
+          <w:color w:val="111111"/>
+          <w:sz w:val="24"/>
+        </w:rPr>
+        <w:t>(</w:t>
+      </w:r>
+      <w:proofErr w:type="spellStart"/>
       <w:proofErr w:type="gramStart"/>
       <w:r>
         <w:rPr>
@@ -2302,7 +2316,7 @@
           <w:color w:val="111111"/>
           <w:sz w:val="24"/>
         </w:rPr>
-        <w:t>gebe</w:t>
+        <w:t>self,neue</w:t>
       </w:r>
       <w:proofErr w:type="gramEnd"/>
       <w:r>
@@ -2312,27 +2326,7 @@
           <w:color w:val="111111"/>
           <w:sz w:val="24"/>
         </w:rPr>
-        <w:t>_gesundheit</w:t>
-      </w:r>
-      <w:proofErr w:type="spellEnd"/>
-      <w:r>
-        <w:rPr>
-          <w:rStyle w:val="HTMLCode"/>
-          <w:rFonts w:ascii="Consolas" w:eastAsiaTheme="majorEastAsia" w:hAnsi="Consolas"/>
-          <w:color w:val="111111"/>
-          <w:sz w:val="24"/>
-        </w:rPr>
-        <w:t>(</w:t>
-      </w:r>
-      <w:proofErr w:type="spellStart"/>
-      <w:r>
-        <w:rPr>
-          <w:rStyle w:val="HTMLCode"/>
-          <w:rFonts w:ascii="Consolas" w:eastAsiaTheme="majorEastAsia" w:hAnsi="Consolas"/>
-          <w:color w:val="111111"/>
-          <w:sz w:val="24"/>
-        </w:rPr>
-        <w:t>self</w:t>
+        <w:t>_richtung</w:t>
       </w:r>
       <w:proofErr w:type="spellEnd"/>
       <w:r>
@@ -2349,7 +2343,7 @@
           <w:rFonts w:ascii="Aptos" w:hAnsi="Aptos"/>
           <w:color w:val="111111"/>
         </w:rPr>
-        <w:t>: Diese Methode gibt die Gesundheit des Sprites zurück.</w:t>
+        <w:t>: Diese Methode setzt die Bewegungsrichtung des Sprites auf die übergebenen Koordinaten.</w:t>
       </w:r>
     </w:p>
     <w:p>
@@ -2367,14 +2361,25 @@
         </w:rPr>
       </w:pPr>
       <w:proofErr w:type="spellStart"/>
-      <w:r>
-        <w:rPr>
-          <w:rStyle w:val="HTMLCode"/>
-          <w:rFonts w:ascii="Consolas" w:eastAsiaTheme="majorEastAsia" w:hAnsi="Consolas"/>
-          <w:color w:val="111111"/>
-          <w:sz w:val="24"/>
-        </w:rPr>
-        <w:t>setze_gesundheit</w:t>
+      <w:proofErr w:type="gramStart"/>
+      <w:r>
+        <w:rPr>
+          <w:rStyle w:val="HTMLCode"/>
+          <w:rFonts w:ascii="Consolas" w:eastAsiaTheme="majorEastAsia" w:hAnsi="Consolas"/>
+          <w:color w:val="111111"/>
+          <w:sz w:val="24"/>
+        </w:rPr>
+        <w:t>gebe</w:t>
+      </w:r>
+      <w:proofErr w:type="gramEnd"/>
+      <w:r>
+        <w:rPr>
+          <w:rStyle w:val="HTMLCode"/>
+          <w:rFonts w:ascii="Consolas" w:eastAsiaTheme="majorEastAsia" w:hAnsi="Consolas"/>
+          <w:color w:val="111111"/>
+          <w:sz w:val="24"/>
+        </w:rPr>
+        <w:t>_namen</w:t>
       </w:r>
       <w:proofErr w:type="spellEnd"/>
       <w:r>
@@ -2387,25 +2392,14 @@
         <w:t>(</w:t>
       </w:r>
       <w:proofErr w:type="spellStart"/>
-      <w:proofErr w:type="gramStart"/>
-      <w:r>
-        <w:rPr>
-          <w:rStyle w:val="HTMLCode"/>
-          <w:rFonts w:ascii="Consolas" w:eastAsiaTheme="majorEastAsia" w:hAnsi="Consolas"/>
-          <w:color w:val="111111"/>
-          <w:sz w:val="24"/>
-        </w:rPr>
-        <w:t>self,neue</w:t>
-      </w:r>
-      <w:proofErr w:type="gramEnd"/>
-      <w:r>
-        <w:rPr>
-          <w:rStyle w:val="HTMLCode"/>
-          <w:rFonts w:ascii="Consolas" w:eastAsiaTheme="majorEastAsia" w:hAnsi="Consolas"/>
-          <w:color w:val="111111"/>
-          <w:sz w:val="24"/>
-        </w:rPr>
-        <w:t>_energie</w:t>
+      <w:r>
+        <w:rPr>
+          <w:rStyle w:val="HTMLCode"/>
+          <w:rFonts w:ascii="Consolas" w:eastAsiaTheme="majorEastAsia" w:hAnsi="Consolas"/>
+          <w:color w:val="111111"/>
+          <w:sz w:val="24"/>
+        </w:rPr>
+        <w:t>self</w:t>
       </w:r>
       <w:proofErr w:type="spellEnd"/>
       <w:r>
@@ -2422,7 +2416,7 @@
           <w:rFonts w:ascii="Aptos" w:hAnsi="Aptos"/>
           <w:color w:val="111111"/>
         </w:rPr>
-        <w:t>: Diese Methode setzt die Gesundheit des Sprites auf den übergebenen Wert.</w:t>
+        <w:t>: Diese Methode gibt den Namen des Sprites zurück.</w:t>
       </w:r>
     </w:p>
     <w:p>
@@ -2447,7 +2441,7 @@
           <w:color w:val="111111"/>
           <w:sz w:val="24"/>
         </w:rPr>
-        <w:t>hole_richtung</w:t>
+        <w:t>scale</w:t>
       </w:r>
       <w:proofErr w:type="spellEnd"/>
       <w:r>
@@ -2460,14 +2454,25 @@
         <w:t>(</w:t>
       </w:r>
       <w:proofErr w:type="spellStart"/>
-      <w:r>
-        <w:rPr>
-          <w:rStyle w:val="HTMLCode"/>
-          <w:rFonts w:ascii="Consolas" w:eastAsiaTheme="majorEastAsia" w:hAnsi="Consolas"/>
-          <w:color w:val="111111"/>
-          <w:sz w:val="24"/>
-        </w:rPr>
-        <w:t>self</w:t>
+      <w:proofErr w:type="gramStart"/>
+      <w:r>
+        <w:rPr>
+          <w:rStyle w:val="HTMLCode"/>
+          <w:rFonts w:ascii="Consolas" w:eastAsiaTheme="majorEastAsia" w:hAnsi="Consolas"/>
+          <w:color w:val="111111"/>
+          <w:sz w:val="24"/>
+        </w:rPr>
+        <w:t>self,breite</w:t>
+      </w:r>
+      <w:proofErr w:type="gramEnd"/>
+      <w:r>
+        <w:rPr>
+          <w:rStyle w:val="HTMLCode"/>
+          <w:rFonts w:ascii="Consolas" w:eastAsiaTheme="majorEastAsia" w:hAnsi="Consolas"/>
+          <w:color w:val="111111"/>
+          <w:sz w:val="24"/>
+        </w:rPr>
+        <w:t>,hoehe</w:t>
       </w:r>
       <w:proofErr w:type="spellEnd"/>
       <w:r>
@@ -2484,7 +2489,7 @@
           <w:rFonts w:ascii="Aptos" w:hAnsi="Aptos"/>
           <w:color w:val="111111"/>
         </w:rPr>
-        <w:t>: Diese Methode gibt die aktuelle Bewegungsrichtung des Sprites zurück.</w:t>
+        <w:t>: Diese Methode skaliert das Bild des Sprites auf die gegebene Breite und Höhe.</w:t>
       </w:r>
     </w:p>
     <w:p>
@@ -2501,27 +2506,6 @@
           <w:color w:val="111111"/>
         </w:rPr>
       </w:pPr>
-      <w:proofErr w:type="spellStart"/>
-      <w:r>
-        <w:rPr>
-          <w:rStyle w:val="HTMLCode"/>
-          <w:rFonts w:ascii="Consolas" w:eastAsiaTheme="majorEastAsia" w:hAnsi="Consolas"/>
-          <w:color w:val="111111"/>
-          <w:sz w:val="24"/>
-        </w:rPr>
-        <w:t>setze_richtung</w:t>
-      </w:r>
-      <w:proofErr w:type="spellEnd"/>
-      <w:r>
-        <w:rPr>
-          <w:rStyle w:val="HTMLCode"/>
-          <w:rFonts w:ascii="Consolas" w:eastAsiaTheme="majorEastAsia" w:hAnsi="Consolas"/>
-          <w:color w:val="111111"/>
-          <w:sz w:val="24"/>
-        </w:rPr>
-        <w:t>(</w:t>
-      </w:r>
-      <w:proofErr w:type="spellStart"/>
       <w:proofErr w:type="gramStart"/>
       <w:r>
         <w:rPr>
@@ -2530,8 +2514,9 @@
           <w:color w:val="111111"/>
           <w:sz w:val="24"/>
         </w:rPr>
-        <w:t>self,neue</w:t>
-      </w:r>
+        <w:t>zeichnen(</w:t>
+      </w:r>
+      <w:proofErr w:type="spellStart"/>
       <w:proofErr w:type="gramEnd"/>
       <w:r>
         <w:rPr>
@@ -2540,7 +2525,27 @@
           <w:color w:val="111111"/>
           <w:sz w:val="24"/>
         </w:rPr>
-        <w:t>_richtung</w:t>
+        <w:t>self</w:t>
+      </w:r>
+      <w:proofErr w:type="spellEnd"/>
+      <w:r>
+        <w:rPr>
+          <w:rStyle w:val="HTMLCode"/>
+          <w:rFonts w:ascii="Consolas" w:eastAsiaTheme="majorEastAsia" w:hAnsi="Consolas"/>
+          <w:color w:val="111111"/>
+          <w:sz w:val="24"/>
+        </w:rPr>
+        <w:t xml:space="preserve">, </w:t>
+      </w:r>
+      <w:proofErr w:type="spellStart"/>
+      <w:r>
+        <w:rPr>
+          <w:rStyle w:val="HTMLCode"/>
+          <w:rFonts w:ascii="Consolas" w:eastAsiaTheme="majorEastAsia" w:hAnsi="Consolas"/>
+          <w:color w:val="111111"/>
+          <w:sz w:val="24"/>
+        </w:rPr>
+        <w:t>fensterobjekt</w:t>
       </w:r>
       <w:proofErr w:type="spellEnd"/>
       <w:r>
@@ -2557,10 +2562,294 @@
           <w:rFonts w:ascii="Aptos" w:hAnsi="Aptos"/>
           <w:color w:val="111111"/>
         </w:rPr>
-        <w:t>: Diese Methode setzt die Bewegungsrichtung des Sprites auf die übergebenen Koordinaten.</w:t>
+        <w:t>: Diese Methode zeichnet das Sprite auf das Spielfenster.</w:t>
       </w:r>
     </w:p>
     <w:p>
+      <w:pPr>
+        <w:pStyle w:val="StandardWeb"/>
+        <w:numPr>
+          <w:ilvl w:val="1"/>
+          <w:numId w:val="4"/>
+        </w:numPr>
+        <w:shd w:val="clear" w:color="auto" w:fill="F7F7F7"/>
+        <w:spacing w:before="0" w:beforeAutospacing="0" w:after="0" w:afterAutospacing="0"/>
+        <w:rPr>
+          <w:rFonts w:ascii="Aptos" w:hAnsi="Aptos"/>
+          <w:color w:val="111111"/>
+        </w:rPr>
+      </w:pPr>
+      <w:proofErr w:type="spellStart"/>
+      <w:r>
+        <w:rPr>
+          <w:rStyle w:val="HTMLCode"/>
+          <w:rFonts w:ascii="Consolas" w:eastAsiaTheme="majorEastAsia" w:hAnsi="Consolas"/>
+          <w:color w:val="111111"/>
+          <w:sz w:val="24"/>
+        </w:rPr>
+        <w:t>neue_position_rechnen</w:t>
+      </w:r>
+      <w:proofErr w:type="spellEnd"/>
+      <w:r>
+        <w:rPr>
+          <w:rStyle w:val="HTMLCode"/>
+          <w:rFonts w:ascii="Consolas" w:eastAsiaTheme="majorEastAsia" w:hAnsi="Consolas"/>
+          <w:color w:val="111111"/>
+          <w:sz w:val="24"/>
+        </w:rPr>
+        <w:t>(</w:t>
+      </w:r>
+      <w:proofErr w:type="spellStart"/>
+      <w:r>
+        <w:rPr>
+          <w:rStyle w:val="HTMLCode"/>
+          <w:rFonts w:ascii="Consolas" w:eastAsiaTheme="majorEastAsia" w:hAnsi="Consolas"/>
+          <w:color w:val="111111"/>
+          <w:sz w:val="24"/>
+        </w:rPr>
+        <w:t>self</w:t>
+      </w:r>
+      <w:proofErr w:type="spellEnd"/>
+      <w:r>
+        <w:rPr>
+          <w:rStyle w:val="HTMLCode"/>
+          <w:rFonts w:ascii="Consolas" w:eastAsiaTheme="majorEastAsia" w:hAnsi="Consolas"/>
+          <w:color w:val="111111"/>
+          <w:sz w:val="24"/>
+        </w:rPr>
+        <w:t>)</w:t>
+      </w:r>
+      <w:r>
+        <w:rPr>
+          <w:rFonts w:ascii="Aptos" w:hAnsi="Aptos"/>
+          <w:color w:val="111111"/>
+        </w:rPr>
+        <w:t>: Diese Methode berechnet die neue Position des Sprites, wenn dies ein NPC ist.</w:t>
+      </w:r>
+    </w:p>
+    <w:p>
+      <w:pPr>
+        <w:pStyle w:val="StandardWeb"/>
+        <w:numPr>
+          <w:ilvl w:val="1"/>
+          <w:numId w:val="4"/>
+        </w:numPr>
+        <w:shd w:val="clear" w:color="auto" w:fill="F7F7F7"/>
+        <w:spacing w:before="0" w:beforeAutospacing="0" w:after="0" w:afterAutospacing="0"/>
+        <w:rPr>
+          <w:rFonts w:ascii="Aptos" w:hAnsi="Aptos"/>
+          <w:color w:val="111111"/>
+        </w:rPr>
+      </w:pPr>
+      <w:proofErr w:type="spellStart"/>
+      <w:r>
+        <w:rPr>
+          <w:rStyle w:val="HTMLCode"/>
+          <w:rFonts w:ascii="Consolas" w:eastAsiaTheme="majorEastAsia" w:hAnsi="Consolas"/>
+          <w:color w:val="111111"/>
+          <w:sz w:val="24"/>
+        </w:rPr>
+        <w:t>neue_position_setzen</w:t>
+      </w:r>
+      <w:proofErr w:type="spellEnd"/>
+      <w:r>
+        <w:rPr>
+          <w:rStyle w:val="HTMLCode"/>
+          <w:rFonts w:ascii="Consolas" w:eastAsiaTheme="majorEastAsia" w:hAnsi="Consolas"/>
+          <w:color w:val="111111"/>
+          <w:sz w:val="24"/>
+        </w:rPr>
+        <w:t>(</w:t>
+      </w:r>
+      <w:proofErr w:type="spellStart"/>
+      <w:proofErr w:type="gramStart"/>
+      <w:r>
+        <w:rPr>
+          <w:rStyle w:val="HTMLCode"/>
+          <w:rFonts w:ascii="Consolas" w:eastAsiaTheme="majorEastAsia" w:hAnsi="Consolas"/>
+          <w:color w:val="111111"/>
+          <w:sz w:val="24"/>
+        </w:rPr>
+        <w:t>self,x</w:t>
+      </w:r>
+      <w:proofErr w:type="gramEnd"/>
+      <w:r>
+        <w:rPr>
+          <w:rStyle w:val="HTMLCode"/>
+          <w:rFonts w:ascii="Consolas" w:eastAsiaTheme="majorEastAsia" w:hAnsi="Consolas"/>
+          <w:color w:val="111111"/>
+          <w:sz w:val="24"/>
+        </w:rPr>
+        <w:t>,y</w:t>
+      </w:r>
+      <w:proofErr w:type="spellEnd"/>
+      <w:r>
+        <w:rPr>
+          <w:rStyle w:val="HTMLCode"/>
+          <w:rFonts w:ascii="Consolas" w:eastAsiaTheme="majorEastAsia" w:hAnsi="Consolas"/>
+          <w:color w:val="111111"/>
+          <w:sz w:val="24"/>
+        </w:rPr>
+        <w:t>)</w:t>
+      </w:r>
+      <w:r>
+        <w:rPr>
+          <w:rFonts w:ascii="Aptos" w:hAnsi="Aptos"/>
+          <w:color w:val="111111"/>
+        </w:rPr>
+        <w:t>: Diese Methode setzt die Position des Sprites auf die übergebenen Koordinaten.</w:t>
+      </w:r>
+    </w:p>
+    <w:p>
+      <w:pPr>
+        <w:pStyle w:val="StandardWeb"/>
+        <w:numPr>
+          <w:ilvl w:val="1"/>
+          <w:numId w:val="4"/>
+        </w:numPr>
+        <w:shd w:val="clear" w:color="auto" w:fill="F7F7F7"/>
+        <w:spacing w:before="0" w:beforeAutospacing="0" w:after="0" w:afterAutospacing="0"/>
+        <w:rPr>
+          <w:rFonts w:ascii="Aptos" w:hAnsi="Aptos"/>
+          <w:color w:val="111111"/>
+        </w:rPr>
+      </w:pPr>
+      <w:proofErr w:type="spellStart"/>
+      <w:r>
+        <w:rPr>
+          <w:rStyle w:val="HTMLCode"/>
+          <w:rFonts w:ascii="Consolas" w:eastAsiaTheme="majorEastAsia" w:hAnsi="Consolas"/>
+          <w:color w:val="111111"/>
+          <w:sz w:val="24"/>
+        </w:rPr>
+        <w:t>hole_position</w:t>
+      </w:r>
+      <w:proofErr w:type="spellEnd"/>
+      <w:r>
+        <w:rPr>
+          <w:rStyle w:val="HTMLCode"/>
+          <w:rFonts w:ascii="Consolas" w:eastAsiaTheme="majorEastAsia" w:hAnsi="Consolas"/>
+          <w:color w:val="111111"/>
+          <w:sz w:val="24"/>
+        </w:rPr>
+        <w:t>(</w:t>
+      </w:r>
+      <w:proofErr w:type="spellStart"/>
+      <w:r>
+        <w:rPr>
+          <w:rStyle w:val="HTMLCode"/>
+          <w:rFonts w:ascii="Consolas" w:eastAsiaTheme="majorEastAsia" w:hAnsi="Consolas"/>
+          <w:color w:val="111111"/>
+          <w:sz w:val="24"/>
+        </w:rPr>
+        <w:t>self</w:t>
+      </w:r>
+      <w:proofErr w:type="spellEnd"/>
+      <w:r>
+        <w:rPr>
+          <w:rStyle w:val="HTMLCode"/>
+          <w:rFonts w:ascii="Consolas" w:eastAsiaTheme="majorEastAsia" w:hAnsi="Consolas"/>
+          <w:color w:val="111111"/>
+          <w:sz w:val="24"/>
+        </w:rPr>
+        <w:t>)</w:t>
+      </w:r>
+      <w:r>
+        <w:rPr>
+          <w:rFonts w:ascii="Aptos" w:hAnsi="Aptos"/>
+          <w:color w:val="111111"/>
+        </w:rPr>
+        <w:t>: Diese Methode gibt die aktuelle Position des Sprites zurück.</w:t>
+      </w:r>
+    </w:p>
+    <w:p>
+      <w:pPr>
+        <w:pStyle w:val="StandardWeb"/>
+        <w:numPr>
+          <w:ilvl w:val="1"/>
+          <w:numId w:val="4"/>
+        </w:numPr>
+        <w:shd w:val="clear" w:color="auto" w:fill="F7F7F7"/>
+        <w:spacing w:before="0" w:beforeAutospacing="0" w:after="0" w:afterAutospacing="0"/>
+      </w:pPr>
+      <w:proofErr w:type="spellStart"/>
+      <w:r>
+        <w:rPr>
+          <w:rStyle w:val="HTMLCode"/>
+          <w:rFonts w:ascii="Consolas" w:eastAsiaTheme="majorEastAsia" w:hAnsi="Consolas"/>
+          <w:color w:val="111111"/>
+          <w:sz w:val="24"/>
+        </w:rPr>
+        <w:t>ist_</w:t>
+      </w:r>
+      <w:proofErr w:type="gramStart"/>
+      <w:r>
+        <w:rPr>
+          <w:rStyle w:val="HTMLCode"/>
+          <w:rFonts w:ascii="Consolas" w:eastAsiaTheme="majorEastAsia" w:hAnsi="Consolas"/>
+          <w:color w:val="111111"/>
+          <w:sz w:val="24"/>
+        </w:rPr>
+        <w:t>kollision</w:t>
+      </w:r>
+      <w:proofErr w:type="spellEnd"/>
+      <w:r>
+        <w:rPr>
+          <w:rStyle w:val="HTMLCode"/>
+          <w:rFonts w:ascii="Consolas" w:eastAsiaTheme="majorEastAsia" w:hAnsi="Consolas"/>
+          <w:color w:val="111111"/>
+          <w:sz w:val="24"/>
+        </w:rPr>
+        <w:t>(</w:t>
+      </w:r>
+      <w:proofErr w:type="spellStart"/>
+      <w:proofErr w:type="gramEnd"/>
+      <w:r>
+        <w:rPr>
+          <w:rStyle w:val="HTMLCode"/>
+          <w:rFonts w:ascii="Consolas" w:eastAsiaTheme="majorEastAsia" w:hAnsi="Consolas"/>
+          <w:color w:val="111111"/>
+          <w:sz w:val="24"/>
+        </w:rPr>
+        <w:t>self</w:t>
+      </w:r>
+      <w:proofErr w:type="spellEnd"/>
+      <w:r>
+        <w:rPr>
+          <w:rStyle w:val="HTMLCode"/>
+          <w:rFonts w:ascii="Consolas" w:eastAsiaTheme="majorEastAsia" w:hAnsi="Consolas"/>
+          <w:color w:val="111111"/>
+          <w:sz w:val="24"/>
+        </w:rPr>
+        <w:t xml:space="preserve">, </w:t>
+      </w:r>
+      <w:proofErr w:type="spellStart"/>
+      <w:r>
+        <w:rPr>
+          <w:rStyle w:val="HTMLCode"/>
+          <w:rFonts w:ascii="Consolas" w:eastAsiaTheme="majorEastAsia" w:hAnsi="Consolas"/>
+          <w:color w:val="111111"/>
+          <w:sz w:val="24"/>
+        </w:rPr>
+        <w:t>spieler</w:t>
+      </w:r>
+      <w:proofErr w:type="spellEnd"/>
+      <w:r>
+        <w:rPr>
+          <w:rStyle w:val="HTMLCode"/>
+          <w:rFonts w:ascii="Consolas" w:eastAsiaTheme="majorEastAsia" w:hAnsi="Consolas"/>
+          <w:color w:val="111111"/>
+          <w:sz w:val="24"/>
+        </w:rPr>
+        <w:t>)</w:t>
+      </w:r>
+      <w:r>
+        <w:rPr>
+          <w:rFonts w:ascii="Aptos" w:hAnsi="Aptos"/>
+          <w:color w:val="111111"/>
+        </w:rPr>
+        <w:t>: Diese Methode prüft, ob es eine Kollision mit einem anderen Sprite gibt</w:t>
+      </w:r>
       <w:r>
         <w:br w:type="page"/>
       </w:r>
@@ -2619,7 +2908,21 @@
           <w:rFonts w:ascii="Aptos" w:hAnsi="Aptos"/>
           <w:color w:val="111111"/>
         </w:rPr>
-        <w:t xml:space="preserve"> ist ein 2D-Bild, das in einem Videospiel verwendet wird. In diesem Fall gibt es drei Sprites: einen Roboter und zwei Arten von Asteroiden.</w:t>
+        <w:t xml:space="preserve"> ist ein 2D-Bild, das in einem Videospiel verwendet wird. In diesem Fall gibt es </w:t>
+      </w:r>
+      <w:r>
+        <w:rPr>
+          <w:rFonts w:ascii="Aptos" w:hAnsi="Aptos"/>
+          <w:color w:val="111111"/>
+        </w:rPr>
+        <w:t>zwei Sprites. Den Spieler und den Gegner</w:t>
+      </w:r>
+      <w:r>
+        <w:rPr>
+          <w:rFonts w:ascii="Aptos" w:hAnsi="Aptos"/>
+          <w:color w:val="111111"/>
+        </w:rPr>
+        <w:t>.</w:t>
       </w:r>
     </w:p>
     <w:p>
@@ -2649,23 +2952,47 @@
           <w:rFonts w:ascii="Aptos" w:hAnsi="Aptos"/>
           <w:color w:val="111111"/>
         </w:rPr>
-        <w:t xml:space="preserve">: Diese Klasse definiert ein Sprite-Objekt. </w:t>
-      </w:r>
-      <w:proofErr w:type="gramStart"/>
-      <w:r>
-        <w:rPr>
-          <w:rFonts w:ascii="Aptos" w:hAnsi="Aptos"/>
-          <w:color w:val="111111"/>
-        </w:rPr>
-        <w:t>Jedes Sprite</w:t>
-      </w:r>
-      <w:proofErr w:type="gramEnd"/>
-      <w:r>
-        <w:rPr>
-          <w:rFonts w:ascii="Aptos" w:hAnsi="Aptos"/>
-          <w:color w:val="111111"/>
-        </w:rPr>
-        <w:t xml:space="preserve"> hat eine Position, eine Größe, eine Gesundheit und eine Bewegungsrichtung. Die Klasse hat auch mehrere Methoden:</w:t>
+        <w:t>: Diese Klasse definiert ein Sprite-Objekt. Jedes Sprite hat eine Position, eine Größe, eine Gesundheit</w:t>
+      </w:r>
+      <w:r>
+        <w:rPr>
+          <w:rFonts w:ascii="Aptos" w:hAnsi="Aptos"/>
+          <w:color w:val="111111"/>
+        </w:rPr>
+        <w:t>, Energie</w:t>
+      </w:r>
+      <w:r>
+        <w:rPr>
+          <w:rFonts w:ascii="Aptos" w:hAnsi="Aptos"/>
+          <w:color w:val="111111"/>
+        </w:rPr>
+        <w:t xml:space="preserve"> und eine Bewegungsrichtung. </w:t>
+      </w:r>
+      <w:r>
+        <w:rPr>
+          <w:rFonts w:ascii="Aptos" w:hAnsi="Aptos"/>
+          <w:color w:val="111111"/>
+        </w:rPr>
+        <w:t>Dabei werden in dieser Klasse nur die Methoden festgelegt, die wir im Kurs verändern und ausbauen werden.</w:t>
+      </w:r>
+    </w:p>
+    <w:p>
+      <w:pPr>
+        <w:pStyle w:val="StandardWeb"/>
+        <w:shd w:val="clear" w:color="auto" w:fill="F7F7F7"/>
+        <w:spacing w:before="0" w:beforeAutospacing="0" w:after="0" w:afterAutospacing="0"/>
+        <w:ind w:left="720"/>
+        <w:rPr>
+          <w:rFonts w:ascii="Aptos" w:hAnsi="Aptos"/>
+          <w:color w:val="111111"/>
+        </w:rPr>
+      </w:pPr>
+      <w:r>
+        <w:rPr>
+          <w:rFonts w:ascii="Aptos" w:hAnsi="Aptos"/>
+          <w:color w:val="111111"/>
+        </w:rPr>
+        <w:t>Die Klasse hat auch mehrere Methoden:</w:t>
       </w:r>
     </w:p>
     <w:p>
@@ -2907,6 +3234,13 @@
         </w:rPr>
         <w:t>).</w:t>
       </w:r>
+      <w:r>
+        <w:rPr>
+          <w:rFonts w:ascii="Aptos" w:hAnsi="Aptos"/>
+          <w:color w:val="111111"/>
+        </w:rPr>
+        <w:t>,</w:t>
+      </w:r>
     </w:p>
     <w:p>
       <w:pPr>
@@ -2923,14 +3257,25 @@
         </w:rPr>
       </w:pPr>
       <w:proofErr w:type="spellStart"/>
-      <w:r>
-        <w:rPr>
-          <w:rStyle w:val="HTMLCode"/>
-          <w:rFonts w:ascii="Consolas" w:eastAsiaTheme="majorEastAsia" w:hAnsi="Consolas"/>
-          <w:color w:val="111111"/>
-          <w:sz w:val="24"/>
-        </w:rPr>
-        <w:t>scale</w:t>
+      <w:proofErr w:type="gramStart"/>
+      <w:r>
+        <w:rPr>
+          <w:rStyle w:val="HTMLCode"/>
+          <w:rFonts w:ascii="Consolas" w:eastAsiaTheme="majorEastAsia" w:hAnsi="Consolas"/>
+          <w:color w:val="111111"/>
+          <w:sz w:val="24"/>
+        </w:rPr>
+        <w:t>gebe</w:t>
+      </w:r>
+      <w:proofErr w:type="gramEnd"/>
+      <w:r>
+        <w:rPr>
+          <w:rStyle w:val="HTMLCode"/>
+          <w:rFonts w:ascii="Consolas" w:eastAsiaTheme="majorEastAsia" w:hAnsi="Consolas"/>
+          <w:color w:val="111111"/>
+          <w:sz w:val="24"/>
+        </w:rPr>
+        <w:t>_gesundheit</w:t>
       </w:r>
       <w:proofErr w:type="spellEnd"/>
       <w:r>
@@ -2943,25 +3288,14 @@
         <w:t>(</w:t>
       </w:r>
       <w:proofErr w:type="spellStart"/>
-      <w:proofErr w:type="gramStart"/>
-      <w:r>
-        <w:rPr>
-          <w:rStyle w:val="HTMLCode"/>
-          <w:rFonts w:ascii="Consolas" w:eastAsiaTheme="majorEastAsia" w:hAnsi="Consolas"/>
-          <w:color w:val="111111"/>
-          <w:sz w:val="24"/>
-        </w:rPr>
-        <w:t>self,breite</w:t>
-      </w:r>
-      <w:proofErr w:type="gramEnd"/>
-      <w:r>
-        <w:rPr>
-          <w:rStyle w:val="HTMLCode"/>
-          <w:rFonts w:ascii="Consolas" w:eastAsiaTheme="majorEastAsia" w:hAnsi="Consolas"/>
-          <w:color w:val="111111"/>
-          <w:sz w:val="24"/>
-        </w:rPr>
-        <w:t>,hoehe</w:t>
+      <w:r>
+        <w:rPr>
+          <w:rStyle w:val="HTMLCode"/>
+          <w:rFonts w:ascii="Consolas" w:eastAsiaTheme="majorEastAsia" w:hAnsi="Consolas"/>
+          <w:color w:val="111111"/>
+          <w:sz w:val="24"/>
+        </w:rPr>
+        <w:t>self</w:t>
       </w:r>
       <w:proofErr w:type="spellEnd"/>
       <w:r>
@@ -2978,7 +3312,7 @@
           <w:rFonts w:ascii="Aptos" w:hAnsi="Aptos"/>
           <w:color w:val="111111"/>
         </w:rPr>
-        <w:t>: Diese Methode skaliert das Bild des Sprites auf die gegebene Breite und Höhe.</w:t>
+        <w:t>: Diese Methode gibt die Gesundheit des Sprites zurück.</w:t>
       </w:r>
     </w:p>
     <w:p>
@@ -2995,6 +3329,27 @@
           <w:color w:val="111111"/>
         </w:rPr>
       </w:pPr>
+      <w:proofErr w:type="spellStart"/>
+      <w:r>
+        <w:rPr>
+          <w:rStyle w:val="HTMLCode"/>
+          <w:rFonts w:ascii="Consolas" w:eastAsiaTheme="majorEastAsia" w:hAnsi="Consolas"/>
+          <w:color w:val="111111"/>
+          <w:sz w:val="24"/>
+        </w:rPr>
+        <w:t>setze_gesundheit</w:t>
+      </w:r>
+      <w:proofErr w:type="spellEnd"/>
+      <w:r>
+        <w:rPr>
+          <w:rStyle w:val="HTMLCode"/>
+          <w:rFonts w:ascii="Consolas" w:eastAsiaTheme="majorEastAsia" w:hAnsi="Consolas"/>
+          <w:color w:val="111111"/>
+          <w:sz w:val="24"/>
+        </w:rPr>
+        <w:t>(</w:t>
+      </w:r>
+      <w:proofErr w:type="spellStart"/>
       <w:proofErr w:type="gramStart"/>
       <w:r>
         <w:rPr>
@@ -3003,9 +3358,8 @@
           <w:color w:val="111111"/>
           <w:sz w:val="24"/>
         </w:rPr>
-        <w:t>zeichnen(</w:t>
-      </w:r>
-      <w:proofErr w:type="spellStart"/>
+        <w:t>self,neue</w:t>
+      </w:r>
       <w:proofErr w:type="gramEnd"/>
       <w:r>
         <w:rPr>
@@ -3014,27 +3368,7 @@
           <w:color w:val="111111"/>
           <w:sz w:val="24"/>
         </w:rPr>
-        <w:t>self</w:t>
-      </w:r>
-      <w:proofErr w:type="spellEnd"/>
-      <w:r>
-        <w:rPr>
-          <w:rStyle w:val="HTMLCode"/>
-          <w:rFonts w:ascii="Consolas" w:eastAsiaTheme="majorEastAsia" w:hAnsi="Consolas"/>
-          <w:color w:val="111111"/>
-          <w:sz w:val="24"/>
-        </w:rPr>
-        <w:t xml:space="preserve">, </w:t>
-      </w:r>
-      <w:proofErr w:type="spellStart"/>
-      <w:r>
-        <w:rPr>
-          <w:rStyle w:val="HTMLCode"/>
-          <w:rFonts w:ascii="Consolas" w:eastAsiaTheme="majorEastAsia" w:hAnsi="Consolas"/>
-          <w:color w:val="111111"/>
-          <w:sz w:val="24"/>
-        </w:rPr>
-        <w:t>fensterobjekt</w:t>
+        <w:t>_energie</w:t>
       </w:r>
       <w:proofErr w:type="spellEnd"/>
       <w:r>
@@ -3051,7 +3385,7 @@
           <w:rFonts w:ascii="Aptos" w:hAnsi="Aptos"/>
           <w:color w:val="111111"/>
         </w:rPr>
-        <w:t>: Diese Methode zeichnet das Sprite auf das Spielfenster.</w:t>
+        <w:t>: Diese Methode setzt die Gesundheit des Sprites auf den übergebenen Wert.</w:t>
       </w:r>
     </w:p>
     <w:p>
@@ -3076,7 +3410,7 @@
           <w:color w:val="111111"/>
           <w:sz w:val="24"/>
         </w:rPr>
-        <w:t>neue_position_rechnen</w:t>
+        <w:t>ist_ausserhalb</w:t>
       </w:r>
       <w:proofErr w:type="spellEnd"/>
       <w:r>
@@ -3113,313 +3447,23 @@
           <w:rFonts w:ascii="Aptos" w:hAnsi="Aptos"/>
           <w:color w:val="111111"/>
         </w:rPr>
-        <w:t>: Diese Methode berechnet die neue Position des Sprites, wenn dies ein NPC ist.</w:t>
-      </w:r>
-    </w:p>
-    <w:p>
-      <w:pPr>
-        <w:pStyle w:val="StandardWeb"/>
-        <w:numPr>
-          <w:ilvl w:val="1"/>
-          <w:numId w:val="4"/>
-        </w:numPr>
-        <w:shd w:val="clear" w:color="auto" w:fill="F7F7F7"/>
-        <w:spacing w:before="0" w:beforeAutospacing="0" w:after="0" w:afterAutospacing="0"/>
-        <w:rPr>
-          <w:rFonts w:ascii="Aptos" w:hAnsi="Aptos"/>
-          <w:color w:val="111111"/>
-        </w:rPr>
-      </w:pPr>
-      <w:proofErr w:type="spellStart"/>
-      <w:r>
-        <w:rPr>
-          <w:rStyle w:val="HTMLCode"/>
-          <w:rFonts w:ascii="Consolas" w:eastAsiaTheme="majorEastAsia" w:hAnsi="Consolas"/>
-          <w:color w:val="111111"/>
-          <w:sz w:val="24"/>
-        </w:rPr>
-        <w:t>neue_position_setzen</w:t>
-      </w:r>
-      <w:proofErr w:type="spellEnd"/>
-      <w:r>
-        <w:rPr>
-          <w:rStyle w:val="HTMLCode"/>
-          <w:rFonts w:ascii="Consolas" w:eastAsiaTheme="majorEastAsia" w:hAnsi="Consolas"/>
-          <w:color w:val="111111"/>
-          <w:sz w:val="24"/>
-        </w:rPr>
-        <w:t>(</w:t>
-      </w:r>
-      <w:proofErr w:type="spellStart"/>
+        <w:t xml:space="preserve">: Diese Methode prüft, ob </w:t>
+      </w:r>
       <w:proofErr w:type="gramStart"/>
       <w:r>
         <w:rPr>
-          <w:rStyle w:val="HTMLCode"/>
-          <w:rFonts w:ascii="Consolas" w:eastAsiaTheme="majorEastAsia" w:hAnsi="Consolas"/>
-          <w:color w:val="111111"/>
-          <w:sz w:val="24"/>
-        </w:rPr>
-        <w:t>self,x</w:t>
+          <w:rFonts w:ascii="Aptos" w:hAnsi="Aptos"/>
+          <w:color w:val="111111"/>
+        </w:rPr>
+        <w:t>das Sprite</w:t>
       </w:r>
       <w:proofErr w:type="gramEnd"/>
       <w:r>
         <w:rPr>
-          <w:rStyle w:val="HTMLCode"/>
-          <w:rFonts w:ascii="Consolas" w:eastAsiaTheme="majorEastAsia" w:hAnsi="Consolas"/>
-          <w:color w:val="111111"/>
-          <w:sz w:val="24"/>
-        </w:rPr>
-        <w:t>,y</w:t>
-      </w:r>
-      <w:proofErr w:type="spellEnd"/>
-      <w:r>
-        <w:rPr>
-          <w:rStyle w:val="HTMLCode"/>
-          <w:rFonts w:ascii="Consolas" w:eastAsiaTheme="majorEastAsia" w:hAnsi="Consolas"/>
-          <w:color w:val="111111"/>
-          <w:sz w:val="24"/>
-        </w:rPr>
-        <w:t>)</w:t>
-      </w:r>
-      <w:r>
-        <w:rPr>
-          <w:rFonts w:ascii="Aptos" w:hAnsi="Aptos"/>
-          <w:color w:val="111111"/>
-        </w:rPr>
-        <w:t>: Diese Methode setzt die Position des Sprites auf die übergebenen Koordinaten.</w:t>
-      </w:r>
-    </w:p>
-    <w:p>
-      <w:pPr>
-        <w:pStyle w:val="StandardWeb"/>
-        <w:numPr>
-          <w:ilvl w:val="1"/>
-          <w:numId w:val="4"/>
-        </w:numPr>
-        <w:shd w:val="clear" w:color="auto" w:fill="F7F7F7"/>
-        <w:spacing w:before="0" w:beforeAutospacing="0" w:after="0" w:afterAutospacing="0"/>
-        <w:rPr>
-          <w:rFonts w:ascii="Aptos" w:hAnsi="Aptos"/>
-          <w:color w:val="111111"/>
-        </w:rPr>
-      </w:pPr>
-      <w:proofErr w:type="spellStart"/>
-      <w:r>
-        <w:rPr>
-          <w:rStyle w:val="HTMLCode"/>
-          <w:rFonts w:ascii="Consolas" w:eastAsiaTheme="majorEastAsia" w:hAnsi="Consolas"/>
-          <w:color w:val="111111"/>
-          <w:sz w:val="24"/>
-        </w:rPr>
-        <w:t>hole_position</w:t>
-      </w:r>
-      <w:proofErr w:type="spellEnd"/>
-      <w:r>
-        <w:rPr>
-          <w:rStyle w:val="HTMLCode"/>
-          <w:rFonts w:ascii="Consolas" w:eastAsiaTheme="majorEastAsia" w:hAnsi="Consolas"/>
-          <w:color w:val="111111"/>
-          <w:sz w:val="24"/>
-        </w:rPr>
-        <w:t>(</w:t>
-      </w:r>
-      <w:proofErr w:type="spellStart"/>
-      <w:r>
-        <w:rPr>
-          <w:rStyle w:val="HTMLCode"/>
-          <w:rFonts w:ascii="Consolas" w:eastAsiaTheme="majorEastAsia" w:hAnsi="Consolas"/>
-          <w:color w:val="111111"/>
-          <w:sz w:val="24"/>
-        </w:rPr>
-        <w:t>self</w:t>
-      </w:r>
-      <w:proofErr w:type="spellEnd"/>
-      <w:r>
-        <w:rPr>
-          <w:rStyle w:val="HTMLCode"/>
-          <w:rFonts w:ascii="Consolas" w:eastAsiaTheme="majorEastAsia" w:hAnsi="Consolas"/>
-          <w:color w:val="111111"/>
-          <w:sz w:val="24"/>
-        </w:rPr>
-        <w:t>)</w:t>
-      </w:r>
-      <w:r>
-        <w:rPr>
-          <w:rFonts w:ascii="Aptos" w:hAnsi="Aptos"/>
-          <w:color w:val="111111"/>
-        </w:rPr>
-        <w:t>: Diese Methode gibt die aktuelle Position des Sprites zurück.</w:t>
-      </w:r>
-    </w:p>
-    <w:p>
-      <w:pPr>
-        <w:pStyle w:val="StandardWeb"/>
-        <w:numPr>
-          <w:ilvl w:val="1"/>
-          <w:numId w:val="4"/>
-        </w:numPr>
-        <w:shd w:val="clear" w:color="auto" w:fill="F7F7F7"/>
-        <w:spacing w:before="0" w:beforeAutospacing="0" w:after="0" w:afterAutospacing="0"/>
-        <w:rPr>
-          <w:rFonts w:ascii="Aptos" w:hAnsi="Aptos"/>
-          <w:color w:val="111111"/>
-        </w:rPr>
-      </w:pPr>
-      <w:proofErr w:type="spellStart"/>
-      <w:r>
-        <w:rPr>
-          <w:rStyle w:val="HTMLCode"/>
-          <w:rFonts w:ascii="Consolas" w:eastAsiaTheme="majorEastAsia" w:hAnsi="Consolas"/>
-          <w:color w:val="111111"/>
-          <w:sz w:val="24"/>
-        </w:rPr>
-        <w:t>ist_ausserhalb</w:t>
-      </w:r>
-      <w:proofErr w:type="spellEnd"/>
-      <w:r>
-        <w:rPr>
-          <w:rStyle w:val="HTMLCode"/>
-          <w:rFonts w:ascii="Consolas" w:eastAsiaTheme="majorEastAsia" w:hAnsi="Consolas"/>
-          <w:color w:val="111111"/>
-          <w:sz w:val="24"/>
-        </w:rPr>
-        <w:t>(</w:t>
-      </w:r>
-      <w:proofErr w:type="spellStart"/>
-      <w:r>
-        <w:rPr>
-          <w:rStyle w:val="HTMLCode"/>
-          <w:rFonts w:ascii="Consolas" w:eastAsiaTheme="majorEastAsia" w:hAnsi="Consolas"/>
-          <w:color w:val="111111"/>
-          <w:sz w:val="24"/>
-        </w:rPr>
-        <w:t>self</w:t>
-      </w:r>
-      <w:proofErr w:type="spellEnd"/>
-      <w:r>
-        <w:rPr>
-          <w:rStyle w:val="HTMLCode"/>
-          <w:rFonts w:ascii="Consolas" w:eastAsiaTheme="majorEastAsia" w:hAnsi="Consolas"/>
-          <w:color w:val="111111"/>
-          <w:sz w:val="24"/>
-        </w:rPr>
-        <w:t>)</w:t>
-      </w:r>
-      <w:r>
-        <w:rPr>
-          <w:rFonts w:ascii="Aptos" w:hAnsi="Aptos"/>
-          <w:color w:val="111111"/>
-        </w:rPr>
-        <w:t xml:space="preserve">: Diese Methode prüft, ob </w:t>
-      </w:r>
-      <w:proofErr w:type="gramStart"/>
-      <w:r>
-        <w:rPr>
-          <w:rFonts w:ascii="Aptos" w:hAnsi="Aptos"/>
-          <w:color w:val="111111"/>
-        </w:rPr>
-        <w:t>das Sprite</w:t>
-      </w:r>
-      <w:proofErr w:type="gramEnd"/>
-      <w:r>
-        <w:rPr>
           <w:rFonts w:ascii="Aptos" w:hAnsi="Aptos"/>
           <w:color w:val="111111"/>
         </w:rPr>
         <w:t xml:space="preserve"> aus dem Spielfeld heraus ist und setzt es gegebenenfalls wieder hinein.</w:t>
-      </w:r>
-    </w:p>
-    <w:p>
-      <w:pPr>
-        <w:pStyle w:val="StandardWeb"/>
-        <w:numPr>
-          <w:ilvl w:val="1"/>
-          <w:numId w:val="4"/>
-        </w:numPr>
-        <w:shd w:val="clear" w:color="auto" w:fill="F7F7F7"/>
-        <w:spacing w:before="0" w:beforeAutospacing="0" w:after="0" w:afterAutospacing="0"/>
-        <w:rPr>
-          <w:rFonts w:ascii="Aptos" w:hAnsi="Aptos"/>
-          <w:color w:val="111111"/>
-        </w:rPr>
-      </w:pPr>
-      <w:proofErr w:type="spellStart"/>
-      <w:r>
-        <w:rPr>
-          <w:rStyle w:val="HTMLCode"/>
-          <w:rFonts w:ascii="Consolas" w:eastAsiaTheme="majorEastAsia" w:hAnsi="Consolas"/>
-          <w:color w:val="111111"/>
-          <w:sz w:val="24"/>
-        </w:rPr>
-        <w:t>ist_</w:t>
-      </w:r>
-      <w:proofErr w:type="gramStart"/>
-      <w:r>
-        <w:rPr>
-          <w:rStyle w:val="HTMLCode"/>
-          <w:rFonts w:ascii="Consolas" w:eastAsiaTheme="majorEastAsia" w:hAnsi="Consolas"/>
-          <w:color w:val="111111"/>
-          <w:sz w:val="24"/>
-        </w:rPr>
-        <w:t>kollision</w:t>
-      </w:r>
-      <w:proofErr w:type="spellEnd"/>
-      <w:r>
-        <w:rPr>
-          <w:rStyle w:val="HTMLCode"/>
-          <w:rFonts w:ascii="Consolas" w:eastAsiaTheme="majorEastAsia" w:hAnsi="Consolas"/>
-          <w:color w:val="111111"/>
-          <w:sz w:val="24"/>
-        </w:rPr>
-        <w:t>(</w:t>
-      </w:r>
-      <w:proofErr w:type="spellStart"/>
-      <w:proofErr w:type="gramEnd"/>
-      <w:r>
-        <w:rPr>
-          <w:rStyle w:val="HTMLCode"/>
-          <w:rFonts w:ascii="Consolas" w:eastAsiaTheme="majorEastAsia" w:hAnsi="Consolas"/>
-          <w:color w:val="111111"/>
-          <w:sz w:val="24"/>
-        </w:rPr>
-        <w:t>self</w:t>
-      </w:r>
-      <w:proofErr w:type="spellEnd"/>
-      <w:r>
-        <w:rPr>
-          <w:rStyle w:val="HTMLCode"/>
-          <w:rFonts w:ascii="Consolas" w:eastAsiaTheme="majorEastAsia" w:hAnsi="Consolas"/>
-          <w:color w:val="111111"/>
-          <w:sz w:val="24"/>
-        </w:rPr>
-        <w:t xml:space="preserve">, </w:t>
-      </w:r>
-      <w:proofErr w:type="spellStart"/>
-      <w:r>
-        <w:rPr>
-          <w:rStyle w:val="HTMLCode"/>
-          <w:rFonts w:ascii="Consolas" w:eastAsiaTheme="majorEastAsia" w:hAnsi="Consolas"/>
-          <w:color w:val="111111"/>
-          <w:sz w:val="24"/>
-        </w:rPr>
-        <w:t>spieler</w:t>
-      </w:r>
-      <w:proofErr w:type="spellEnd"/>
-      <w:r>
-        <w:rPr>
-          <w:rStyle w:val="HTMLCode"/>
-          <w:rFonts w:ascii="Consolas" w:eastAsiaTheme="majorEastAsia" w:hAnsi="Consolas"/>
-          <w:color w:val="111111"/>
-          <w:sz w:val="24"/>
-        </w:rPr>
-        <w:t>)</w:t>
-      </w:r>
-      <w:r>
-        <w:rPr>
-          <w:rFonts w:ascii="Aptos" w:hAnsi="Aptos"/>
-          <w:color w:val="111111"/>
-        </w:rPr>
-        <w:t>: Diese Methode prüft, ob es eine Kollision mit einem anderen Sprite gibt.</w:t>
       </w:r>
     </w:p>
     <w:p>
@@ -5037,7 +5081,6 @@
     <w:name w:val="Normal (Web)"/>
     <w:basedOn w:val="Standard"/>
     <w:uiPriority w:val="99"/>
-    <w:semiHidden/>
     <w:unhideWhenUsed/>
     <w:rsid w:val="00C660A0"/>
     <w:pPr>

</xml_diff>